<commit_message>
Structure Word feedback like mock exams
</commit_message>
<xml_diff>
--- a/mod/scorm/studytopic/samples/Real_General_Cautions_Mock_10_Book_Preview.docx
+++ b/mod/scorm/studytopic/samples/Real_General_Cautions_Mock_10_Book_Preview.docx
@@ -277,20 +277,123 @@
     </w:p>
     <w:p>
       <w:pPr>
+        <w:keepNext/>
+        <w:spacing w:before="100" w:after="50"/>
+      </w:pPr>
+      <w:r>
+        <w:rPr>
+          <w:b/>
+          <w:color w:val="17324D"/>
+        </w:rPr>
+        <w:t xml:space="preserve">Why the correct answer is correct</w:t>
+      </w:r>
+    </w:p>
+    <w:p>
+      <w:pPr>
         <w:keepLines/>
         <w:spacing w:before="0" w:after="100"/>
         <w:ind w:left="180" w:right="120"/>
-        <w:shd w:val="clear" w:color="auto" w:fill="EEF7FA"/>
-        <w:pBdr>
-          <w:left w:val="single" w:sz="20" w:space="8" w:color="58A6B8"/>
-        </w:pBdr>
-      </w:pPr>
-      <w:r>
-        <w:rPr>
-          <w:i/>
-          <w:color w:val="31586B"/>
-        </w:rPr>
-        <w:t xml:space="preserve">Correct-answer feedback: Symptoms present before treatment belong first to screening and baseline assessment. Why are the other options incorrect? A fixed contraindication attached to every acupuncture point. — The concern comes from the patient’s current condition, not every point. Proof of pneumothorax. — The scenario does not provide thoracic symptoms or a treatment-related event. A historical moxibustion restriction. — No named modality or historical source is involved.</w:t>
+        <w:shd w:val="clear" w:color="auto" w:fill="EAF6EE"/>
+        <w:pBdr>
+          <w:left w:val="single" w:sz="20" w:space="8" w:color="2E8B57"/>
+        </w:pBdr>
+      </w:pPr>
+      <w:r>
+        <w:rPr>
+          <w:color w:val="245B38"/>
+        </w:rPr>
+        <w:t xml:space="preserve">Symptoms present before treatment belong first to screening and baseline assessment.</w:t>
+      </w:r>
+    </w:p>
+    <w:p>
+      <w:pPr>
+        <w:keepNext/>
+        <w:spacing w:before="100" w:after="50"/>
+      </w:pPr>
+      <w:r>
+        <w:rPr>
+          <w:b/>
+          <w:color w:val="17324D"/>
+        </w:rPr>
+        <w:t xml:space="preserve">Why the other options are incorrect</w:t>
+      </w:r>
+    </w:p>
+    <w:p>
+      <w:pPr>
+        <w:keepLines/>
+        <w:spacing w:before="0" w:after="80"/>
+        <w:ind w:left="180" w:right="120"/>
+        <w:shd w:val="clear" w:color="auto" w:fill="FDF1F1"/>
+        <w:pBdr>
+          <w:left w:val="single" w:sz="20" w:space="8" w:color="C96D6D"/>
+        </w:pBdr>
+      </w:pPr>
+      <w:r>
+        <w:rPr>
+          <w:color w:val="6B3030"/>
+        </w:rPr>
+        <w:t xml:space="preserve">B) A fixed contraindication attached to every acupuncture point.</w:t>
+      </w:r>
+      <w:r>
+        <w:br/>
+      </w:r>
+      <w:r>
+        <w:rPr>
+          <w:color w:val="6B3030"/>
+        </w:rPr>
+        <w:t xml:space="preserve">The concern comes from the patient’s current condition, not every point.</w:t>
+      </w:r>
+    </w:p>
+    <w:p>
+      <w:pPr>
+        <w:keepLines/>
+        <w:spacing w:before="0" w:after="80"/>
+        <w:ind w:left="180" w:right="120"/>
+        <w:shd w:val="clear" w:color="auto" w:fill="FDF1F1"/>
+        <w:pBdr>
+          <w:left w:val="single" w:sz="20" w:space="8" w:color="C96D6D"/>
+        </w:pBdr>
+      </w:pPr>
+      <w:r>
+        <w:rPr>
+          <w:color w:val="6B3030"/>
+        </w:rPr>
+        <w:t xml:space="preserve">C) Proof of pneumothorax.</w:t>
+      </w:r>
+      <w:r>
+        <w:br/>
+      </w:r>
+      <w:r>
+        <w:rPr>
+          <w:color w:val="6B3030"/>
+        </w:rPr>
+        <w:t xml:space="preserve">The scenario does not provide thoracic symptoms or a treatment-related event.</w:t>
+      </w:r>
+    </w:p>
+    <w:p>
+      <w:pPr>
+        <w:keepLines/>
+        <w:spacing w:before="0" w:after="80"/>
+        <w:ind w:left="180" w:right="120"/>
+        <w:shd w:val="clear" w:color="auto" w:fill="FDF1F1"/>
+        <w:pBdr>
+          <w:left w:val="single" w:sz="20" w:space="8" w:color="C96D6D"/>
+        </w:pBdr>
+      </w:pPr>
+      <w:r>
+        <w:rPr>
+          <w:color w:val="6B3030"/>
+        </w:rPr>
+        <w:t xml:space="preserve">D) A historical moxibustion restriction.</w:t>
+      </w:r>
+      <w:r>
+        <w:br/>
+      </w:r>
+      <w:r>
+        <w:rPr>
+          <w:color w:val="6B3030"/>
+        </w:rPr>
+        <w:t xml:space="preserve">No named modality or historical source is involved.</w:t>
       </w:r>
     </w:p>
     <w:p>
@@ -418,20 +521,123 @@
     </w:p>
     <w:p>
       <w:pPr>
+        <w:keepNext/>
+        <w:spacing w:before="100" w:after="50"/>
+      </w:pPr>
+      <w:r>
+        <w:rPr>
+          <w:b/>
+          <w:color w:val="17324D"/>
+        </w:rPr>
+        <w:t xml:space="preserve">Why the correct answer is correct</w:t>
+      </w:r>
+    </w:p>
+    <w:p>
+      <w:pPr>
         <w:keepLines/>
         <w:spacing w:before="0" w:after="100"/>
         <w:ind w:left="180" w:right="120"/>
-        <w:shd w:val="clear" w:color="auto" w:fill="EEF7FA"/>
-        <w:pBdr>
-          <w:left w:val="single" w:sz="20" w:space="8" w:color="58A6B8"/>
-        </w:pBdr>
-      </w:pPr>
-      <w:r>
-        <w:rPr>
-          <w:i/>
-          <w:color w:val="31586B"/>
-        </w:rPr>
-        <w:t xml:space="preserve">Correct-answer feedback: This cluster matches the recognition pattern described in the supplied safety source. Why are the other options incorrect? Localized itching alone. — A single local skin symptom does not match the systemic cluster. Gradual study fatigue after reading. — Study fatigue is not an acute clinical event. A remembered point name without symptoms. — A point name alone does not identify an adverse response.</w:t>
+        <w:shd w:val="clear" w:color="auto" w:fill="EAF6EE"/>
+        <w:pBdr>
+          <w:left w:val="single" w:sz="20" w:space="8" w:color="2E8B57"/>
+        </w:pBdr>
+      </w:pPr>
+      <w:r>
+        <w:rPr>
+          <w:color w:val="245B38"/>
+        </w:rPr>
+        <w:t xml:space="preserve">This cluster matches the recognition pattern described in the supplied safety source.</w:t>
+      </w:r>
+    </w:p>
+    <w:p>
+      <w:pPr>
+        <w:keepNext/>
+        <w:spacing w:before="100" w:after="50"/>
+      </w:pPr>
+      <w:r>
+        <w:rPr>
+          <w:b/>
+          <w:color w:val="17324D"/>
+        </w:rPr>
+        <w:t xml:space="preserve">Why the other options are incorrect</w:t>
+      </w:r>
+    </w:p>
+    <w:p>
+      <w:pPr>
+        <w:keepLines/>
+        <w:spacing w:before="0" w:after="80"/>
+        <w:ind w:left="180" w:right="120"/>
+        <w:shd w:val="clear" w:color="auto" w:fill="FDF1F1"/>
+        <w:pBdr>
+          <w:left w:val="single" w:sz="20" w:space="8" w:color="C96D6D"/>
+        </w:pBdr>
+      </w:pPr>
+      <w:r>
+        <w:rPr>
+          <w:color w:val="6B3030"/>
+        </w:rPr>
+        <w:t xml:space="preserve">A) Localized itching alone.</w:t>
+      </w:r>
+      <w:r>
+        <w:br/>
+      </w:r>
+      <w:r>
+        <w:rPr>
+          <w:color w:val="6B3030"/>
+        </w:rPr>
+        <w:t xml:space="preserve">A single local skin symptom does not match the systemic cluster.</w:t>
+      </w:r>
+    </w:p>
+    <w:p>
+      <w:pPr>
+        <w:keepLines/>
+        <w:spacing w:before="0" w:after="80"/>
+        <w:ind w:left="180" w:right="120"/>
+        <w:shd w:val="clear" w:color="auto" w:fill="FDF1F1"/>
+        <w:pBdr>
+          <w:left w:val="single" w:sz="20" w:space="8" w:color="C96D6D"/>
+        </w:pBdr>
+      </w:pPr>
+      <w:r>
+        <w:rPr>
+          <w:color w:val="6B3030"/>
+        </w:rPr>
+        <w:t xml:space="preserve">B) Gradual study fatigue after reading.</w:t>
+      </w:r>
+      <w:r>
+        <w:br/>
+      </w:r>
+      <w:r>
+        <w:rPr>
+          <w:color w:val="6B3030"/>
+        </w:rPr>
+        <w:t xml:space="preserve">Study fatigue is not an acute clinical event.</w:t>
+      </w:r>
+    </w:p>
+    <w:p>
+      <w:pPr>
+        <w:keepLines/>
+        <w:spacing w:before="0" w:after="80"/>
+        <w:ind w:left="180" w:right="120"/>
+        <w:shd w:val="clear" w:color="auto" w:fill="FDF1F1"/>
+        <w:pBdr>
+          <w:left w:val="single" w:sz="20" w:space="8" w:color="C96D6D"/>
+        </w:pBdr>
+      </w:pPr>
+      <w:r>
+        <w:rPr>
+          <w:color w:val="6B3030"/>
+        </w:rPr>
+        <w:t xml:space="preserve">C) A remembered point name without symptoms.</w:t>
+      </w:r>
+      <w:r>
+        <w:br/>
+      </w:r>
+      <w:r>
+        <w:rPr>
+          <w:color w:val="6B3030"/>
+        </w:rPr>
+        <w:t xml:space="preserve">A point name alone does not identify an adverse response.</w:t>
       </w:r>
     </w:p>
     <w:p>
@@ -559,20 +765,123 @@
     </w:p>
     <w:p>
       <w:pPr>
+        <w:keepNext/>
+        <w:spacing w:before="100" w:after="50"/>
+      </w:pPr>
+      <w:r>
+        <w:rPr>
+          <w:b/>
+          <w:color w:val="17324D"/>
+        </w:rPr>
+        <w:t xml:space="preserve">Why the correct answer is correct</w:t>
+      </w:r>
+    </w:p>
+    <w:p>
+      <w:pPr>
         <w:keepLines/>
         <w:spacing w:before="0" w:after="100"/>
         <w:ind w:left="180" w:right="120"/>
-        <w:shd w:val="clear" w:color="auto" w:fill="EEF7FA"/>
-        <w:pBdr>
-          <w:left w:val="single" w:sz="20" w:space="8" w:color="58A6B8"/>
-        </w:pBdr>
-      </w:pPr>
-      <w:r>
-        <w:rPr>
-          <w:i/>
-          <w:color w:val="31586B"/>
-        </w:rPr>
-        <w:t xml:space="preserve">Correct-answer feedback: A brief legacy label is insufficient for a current universal claim. Why are the other options incorrect? Ignore the warning because it is old. — Historical material can still flag a real issue that requires verification. Replace it with a mnemonic. — A mnemonic cannot establish current clinical guidance. Treat the label as an absolute rule in every context. — The missing mechanism and source status prevent that conclusion.</w:t>
+        <w:shd w:val="clear" w:color="auto" w:fill="EAF6EE"/>
+        <w:pBdr>
+          <w:left w:val="single" w:sz="20" w:space="8" w:color="2E8B57"/>
+        </w:pBdr>
+      </w:pPr>
+      <w:r>
+        <w:rPr>
+          <w:color w:val="245B38"/>
+        </w:rPr>
+        <w:t xml:space="preserve">A brief legacy label is insufficient for a current universal claim.</w:t>
+      </w:r>
+    </w:p>
+    <w:p>
+      <w:pPr>
+        <w:keepNext/>
+        <w:spacing w:before="100" w:after="50"/>
+      </w:pPr>
+      <w:r>
+        <w:rPr>
+          <w:b/>
+          <w:color w:val="17324D"/>
+        </w:rPr>
+        <w:t xml:space="preserve">Why the other options are incorrect</w:t>
+      </w:r>
+    </w:p>
+    <w:p>
+      <w:pPr>
+        <w:keepLines/>
+        <w:spacing w:before="0" w:after="80"/>
+        <w:ind w:left="180" w:right="120"/>
+        <w:shd w:val="clear" w:color="auto" w:fill="FDF1F1"/>
+        <w:pBdr>
+          <w:left w:val="single" w:sz="20" w:space="8" w:color="C96D6D"/>
+        </w:pBdr>
+      </w:pPr>
+      <w:r>
+        <w:rPr>
+          <w:color w:val="6B3030"/>
+        </w:rPr>
+        <w:t xml:space="preserve">A) Ignore the warning because it is old.</w:t>
+      </w:r>
+      <w:r>
+        <w:br/>
+      </w:r>
+      <w:r>
+        <w:rPr>
+          <w:color w:val="6B3030"/>
+        </w:rPr>
+        <w:t xml:space="preserve">Historical material can still flag a real issue that requires verification.</w:t>
+      </w:r>
+    </w:p>
+    <w:p>
+      <w:pPr>
+        <w:keepLines/>
+        <w:spacing w:before="0" w:after="80"/>
+        <w:ind w:left="180" w:right="120"/>
+        <w:shd w:val="clear" w:color="auto" w:fill="FDF1F1"/>
+        <w:pBdr>
+          <w:left w:val="single" w:sz="20" w:space="8" w:color="C96D6D"/>
+        </w:pBdr>
+      </w:pPr>
+      <w:r>
+        <w:rPr>
+          <w:color w:val="6B3030"/>
+        </w:rPr>
+        <w:t xml:space="preserve">B) Replace it with a mnemonic.</w:t>
+      </w:r>
+      <w:r>
+        <w:br/>
+      </w:r>
+      <w:r>
+        <w:rPr>
+          <w:color w:val="6B3030"/>
+        </w:rPr>
+        <w:t xml:space="preserve">A mnemonic cannot establish current clinical guidance.</w:t>
+      </w:r>
+    </w:p>
+    <w:p>
+      <w:pPr>
+        <w:keepLines/>
+        <w:spacing w:before="0" w:after="80"/>
+        <w:ind w:left="180" w:right="120"/>
+        <w:shd w:val="clear" w:color="auto" w:fill="FDF1F1"/>
+        <w:pBdr>
+          <w:left w:val="single" w:sz="20" w:space="8" w:color="C96D6D"/>
+        </w:pBdr>
+      </w:pPr>
+      <w:r>
+        <w:rPr>
+          <w:color w:val="6B3030"/>
+        </w:rPr>
+        <w:t xml:space="preserve">D) Treat the label as an absolute rule in every context.</w:t>
+      </w:r>
+      <w:r>
+        <w:br/>
+      </w:r>
+      <w:r>
+        <w:rPr>
+          <w:color w:val="6B3030"/>
+        </w:rPr>
+        <w:t xml:space="preserve">The missing mechanism and source status prevent that conclusion.</w:t>
       </w:r>
     </w:p>
     <w:p>
@@ -700,20 +1009,123 @@
     </w:p>
     <w:p>
       <w:pPr>
+        <w:keepNext/>
+        <w:spacing w:before="100" w:after="50"/>
+      </w:pPr>
+      <w:r>
+        <w:rPr>
+          <w:b/>
+          <w:color w:val="17324D"/>
+        </w:rPr>
+        <w:t xml:space="preserve">Why the correct answer is correct</w:t>
+      </w:r>
+    </w:p>
+    <w:p>
+      <w:pPr>
         <w:keepLines/>
         <w:spacing w:before="0" w:after="100"/>
         <w:ind w:left="180" w:right="120"/>
-        <w:shd w:val="clear" w:color="auto" w:fill="EEF7FA"/>
-        <w:pBdr>
-          <w:left w:val="single" w:sz="20" w:space="8" w:color="58A6B8"/>
-        </w:pBdr>
-      </w:pPr>
-      <w:r>
-        <w:rPr>
-          <w:i/>
-          <w:color w:val="31586B"/>
-        </w:rPr>
-        <w:t xml:space="preserve">Correct-answer feedback: Local pathology is assessed separately from channel identity. Why are the other options incorrect? The number of points in the channel. — Channel length is unrelated to local tissue integrity. The learner’s last examination score. — An exam score is not a patient-site factor. The color used in a pathway diagram. — Diagram color does not describe tissue condition.</w:t>
+        <w:shd w:val="clear" w:color="auto" w:fill="EAF6EE"/>
+        <w:pBdr>
+          <w:left w:val="single" w:sz="20" w:space="8" w:color="2E8B57"/>
+        </w:pBdr>
+      </w:pPr>
+      <w:r>
+        <w:rPr>
+          <w:color w:val="245B38"/>
+        </w:rPr>
+        <w:t xml:space="preserve">Local pathology is assessed separately from channel identity.</w:t>
+      </w:r>
+    </w:p>
+    <w:p>
+      <w:pPr>
+        <w:keepNext/>
+        <w:spacing w:before="100" w:after="50"/>
+      </w:pPr>
+      <w:r>
+        <w:rPr>
+          <w:b/>
+          <w:color w:val="17324D"/>
+        </w:rPr>
+        <w:t xml:space="preserve">Why the other options are incorrect</w:t>
+      </w:r>
+    </w:p>
+    <w:p>
+      <w:pPr>
+        <w:keepLines/>
+        <w:spacing w:before="0" w:after="80"/>
+        <w:ind w:left="180" w:right="120"/>
+        <w:shd w:val="clear" w:color="auto" w:fill="FDF1F1"/>
+        <w:pBdr>
+          <w:left w:val="single" w:sz="20" w:space="8" w:color="C96D6D"/>
+        </w:pBdr>
+      </w:pPr>
+      <w:r>
+        <w:rPr>
+          <w:color w:val="6B3030"/>
+        </w:rPr>
+        <w:t xml:space="preserve">A) The number of points in the channel.</w:t>
+      </w:r>
+      <w:r>
+        <w:br/>
+      </w:r>
+      <w:r>
+        <w:rPr>
+          <w:color w:val="6B3030"/>
+        </w:rPr>
+        <w:t xml:space="preserve">Channel length is unrelated to local tissue integrity.</w:t>
+      </w:r>
+    </w:p>
+    <w:p>
+      <w:pPr>
+        <w:keepLines/>
+        <w:spacing w:before="0" w:after="80"/>
+        <w:ind w:left="180" w:right="120"/>
+        <w:shd w:val="clear" w:color="auto" w:fill="FDF1F1"/>
+        <w:pBdr>
+          <w:left w:val="single" w:sz="20" w:space="8" w:color="C96D6D"/>
+        </w:pBdr>
+      </w:pPr>
+      <w:r>
+        <w:rPr>
+          <w:color w:val="6B3030"/>
+        </w:rPr>
+        <w:t xml:space="preserve">C) The learner’s last examination score.</w:t>
+      </w:r>
+      <w:r>
+        <w:br/>
+      </w:r>
+      <w:r>
+        <w:rPr>
+          <w:color w:val="6B3030"/>
+        </w:rPr>
+        <w:t xml:space="preserve">An exam score is not a patient-site factor.</w:t>
+      </w:r>
+    </w:p>
+    <w:p>
+      <w:pPr>
+        <w:keepLines/>
+        <w:spacing w:before="0" w:after="80"/>
+        <w:ind w:left="180" w:right="120"/>
+        <w:shd w:val="clear" w:color="auto" w:fill="FDF1F1"/>
+        <w:pBdr>
+          <w:left w:val="single" w:sz="20" w:space="8" w:color="C96D6D"/>
+        </w:pBdr>
+      </w:pPr>
+      <w:r>
+        <w:rPr>
+          <w:color w:val="6B3030"/>
+        </w:rPr>
+        <w:t xml:space="preserve">D) The color used in a pathway diagram.</w:t>
+      </w:r>
+      <w:r>
+        <w:br/>
+      </w:r>
+      <w:r>
+        <w:rPr>
+          <w:color w:val="6B3030"/>
+        </w:rPr>
+        <w:t xml:space="preserve">Diagram color does not describe tissue condition.</w:t>
       </w:r>
     </w:p>
     <w:p>
@@ -841,20 +1253,123 @@
     </w:p>
     <w:p>
       <w:pPr>
+        <w:keepNext/>
+        <w:spacing w:before="100" w:after="50"/>
+      </w:pPr>
+      <w:r>
+        <w:rPr>
+          <w:b/>
+          <w:color w:val="17324D"/>
+        </w:rPr>
+        <w:t xml:space="preserve">Why the correct answer is correct</w:t>
+      </w:r>
+    </w:p>
+    <w:p>
+      <w:pPr>
         <w:keepLines/>
         <w:spacing w:before="0" w:after="100"/>
         <w:ind w:left="180" w:right="120"/>
-        <w:shd w:val="clear" w:color="auto" w:fill="EEF7FA"/>
-        <w:pBdr>
-          <w:left w:val="single" w:sz="20" w:space="8" w:color="58A6B8"/>
-        </w:pBdr>
-      </w:pPr>
-      <w:r>
-        <w:rPr>
-          <w:i/>
-          <w:color w:val="31586B"/>
-        </w:rPr>
-        <w:t xml:space="preserve">Correct-answer feedback: Neural and vascular warning cues have different anatomical mechanisms. Why are the other options incorrect? It always proves normal deqi. — An unexpected electrical sensation requires caution and assessment. It identifies pregnancy. — It is a sensory cue, not a pregnancy screen. It is only a moxa reaction. — The scenario concerns needling sensation, not heat.</w:t>
+        <w:shd w:val="clear" w:color="auto" w:fill="EAF6EE"/>
+        <w:pBdr>
+          <w:left w:val="single" w:sz="20" w:space="8" w:color="2E8B57"/>
+        </w:pBdr>
+      </w:pPr>
+      <w:r>
+        <w:rPr>
+          <w:color w:val="245B38"/>
+        </w:rPr>
+        <w:t xml:space="preserve">Neural and vascular warning cues have different anatomical mechanisms.</w:t>
+      </w:r>
+    </w:p>
+    <w:p>
+      <w:pPr>
+        <w:keepNext/>
+        <w:spacing w:before="100" w:after="50"/>
+      </w:pPr>
+      <w:r>
+        <w:rPr>
+          <w:b/>
+          <w:color w:val="17324D"/>
+        </w:rPr>
+        <w:t xml:space="preserve">Why the other options are incorrect</w:t>
+      </w:r>
+    </w:p>
+    <w:p>
+      <w:pPr>
+        <w:keepLines/>
+        <w:spacing w:before="0" w:after="80"/>
+        <w:ind w:left="180" w:right="120"/>
+        <w:shd w:val="clear" w:color="auto" w:fill="FDF1F1"/>
+        <w:pBdr>
+          <w:left w:val="single" w:sz="20" w:space="8" w:color="C96D6D"/>
+        </w:pBdr>
+      </w:pPr>
+      <w:r>
+        <w:rPr>
+          <w:color w:val="6B3030"/>
+        </w:rPr>
+        <w:t xml:space="preserve">B) It always proves normal deqi.</w:t>
+      </w:r>
+      <w:r>
+        <w:br/>
+      </w:r>
+      <w:r>
+        <w:rPr>
+          <w:color w:val="6B3030"/>
+        </w:rPr>
+        <w:t xml:space="preserve">An unexpected electrical sensation requires caution and assessment.</w:t>
+      </w:r>
+    </w:p>
+    <w:p>
+      <w:pPr>
+        <w:keepLines/>
+        <w:spacing w:before="0" w:after="80"/>
+        <w:ind w:left="180" w:right="120"/>
+        <w:shd w:val="clear" w:color="auto" w:fill="FDF1F1"/>
+        <w:pBdr>
+          <w:left w:val="single" w:sz="20" w:space="8" w:color="C96D6D"/>
+        </w:pBdr>
+      </w:pPr>
+      <w:r>
+        <w:rPr>
+          <w:color w:val="6B3030"/>
+        </w:rPr>
+        <w:t xml:space="preserve">C) It identifies pregnancy.</w:t>
+      </w:r>
+      <w:r>
+        <w:br/>
+      </w:r>
+      <w:r>
+        <w:rPr>
+          <w:color w:val="6B3030"/>
+        </w:rPr>
+        <w:t xml:space="preserve">It is a sensory cue, not a pregnancy screen.</w:t>
+      </w:r>
+    </w:p>
+    <w:p>
+      <w:pPr>
+        <w:keepLines/>
+        <w:spacing w:before="0" w:after="80"/>
+        <w:ind w:left="180" w:right="120"/>
+        <w:shd w:val="clear" w:color="auto" w:fill="FDF1F1"/>
+        <w:pBdr>
+          <w:left w:val="single" w:sz="20" w:space="8" w:color="C96D6D"/>
+        </w:pBdr>
+      </w:pPr>
+      <w:r>
+        <w:rPr>
+          <w:color w:val="6B3030"/>
+        </w:rPr>
+        <w:t xml:space="preserve">D) It is only a moxa reaction.</w:t>
+      </w:r>
+      <w:r>
+        <w:br/>
+      </w:r>
+      <w:r>
+        <w:rPr>
+          <w:color w:val="6B3030"/>
+        </w:rPr>
+        <w:t xml:space="preserve">The scenario concerns needling sensation, not heat.</w:t>
       </w:r>
     </w:p>
     <w:p>
@@ -982,20 +1497,123 @@
     </w:p>
     <w:p>
       <w:pPr>
+        <w:keepNext/>
+        <w:spacing w:before="100" w:after="50"/>
+      </w:pPr>
+      <w:r>
+        <w:rPr>
+          <w:b/>
+          <w:color w:val="17324D"/>
+        </w:rPr>
+        <w:t xml:space="preserve">Why the correct answer is correct</w:t>
+      </w:r>
+    </w:p>
+    <w:p>
+      <w:pPr>
         <w:keepLines/>
         <w:spacing w:before="0" w:after="100"/>
         <w:ind w:left="180" w:right="120"/>
-        <w:shd w:val="clear" w:color="auto" w:fill="EEF7FA"/>
-        <w:pBdr>
-          <w:left w:val="single" w:sz="20" w:space="8" w:color="58A6B8"/>
-        </w:pBdr>
-      </w:pPr>
-      <w:r>
-        <w:rPr>
-          <w:i/>
-          <w:color w:val="31586B"/>
-        </w:rPr>
-        <w:t xml:space="preserve">Correct-answer feedback: Temporal sequence and baseline documentation prevent unsupported causal claims. Why are the other options incorrect? Any symptom after treatment was caused by treatment. — Timing alone does not prove causation. Symptoms before treatment can be ignored. — Baseline symptoms are essential to assessment. The point name determines causation by itself. — A point name cannot establish causality.</w:t>
+        <w:shd w:val="clear" w:color="auto" w:fill="EAF6EE"/>
+        <w:pBdr>
+          <w:left w:val="single" w:sz="20" w:space="8" w:color="2E8B57"/>
+        </w:pBdr>
+      </w:pPr>
+      <w:r>
+        <w:rPr>
+          <w:color w:val="245B38"/>
+        </w:rPr>
+        <w:t xml:space="preserve">Temporal sequence and baseline documentation prevent unsupported causal claims.</w:t>
+      </w:r>
+    </w:p>
+    <w:p>
+      <w:pPr>
+        <w:keepNext/>
+        <w:spacing w:before="100" w:after="50"/>
+      </w:pPr>
+      <w:r>
+        <w:rPr>
+          <w:b/>
+          <w:color w:val="17324D"/>
+        </w:rPr>
+        <w:t xml:space="preserve">Why the other options are incorrect</w:t>
+      </w:r>
+    </w:p>
+    <w:p>
+      <w:pPr>
+        <w:keepLines/>
+        <w:spacing w:before="0" w:after="80"/>
+        <w:ind w:left="180" w:right="120"/>
+        <w:shd w:val="clear" w:color="auto" w:fill="FDF1F1"/>
+        <w:pBdr>
+          <w:left w:val="single" w:sz="20" w:space="8" w:color="C96D6D"/>
+        </w:pBdr>
+      </w:pPr>
+      <w:r>
+        <w:rPr>
+          <w:color w:val="6B3030"/>
+        </w:rPr>
+        <w:t xml:space="preserve">A) Any symptom after treatment was caused by treatment.</w:t>
+      </w:r>
+      <w:r>
+        <w:br/>
+      </w:r>
+      <w:r>
+        <w:rPr>
+          <w:color w:val="6B3030"/>
+        </w:rPr>
+        <w:t xml:space="preserve">Timing alone does not prove causation.</w:t>
+      </w:r>
+    </w:p>
+    <w:p>
+      <w:pPr>
+        <w:keepLines/>
+        <w:spacing w:before="0" w:after="80"/>
+        <w:ind w:left="180" w:right="120"/>
+        <w:shd w:val="clear" w:color="auto" w:fill="FDF1F1"/>
+        <w:pBdr>
+          <w:left w:val="single" w:sz="20" w:space="8" w:color="C96D6D"/>
+        </w:pBdr>
+      </w:pPr>
+      <w:r>
+        <w:rPr>
+          <w:color w:val="6B3030"/>
+        </w:rPr>
+        <w:t xml:space="preserve">B) Symptoms before treatment can be ignored.</w:t>
+      </w:r>
+      <w:r>
+        <w:br/>
+      </w:r>
+      <w:r>
+        <w:rPr>
+          <w:color w:val="6B3030"/>
+        </w:rPr>
+        <w:t xml:space="preserve">Baseline symptoms are essential to assessment.</w:t>
+      </w:r>
+    </w:p>
+    <w:p>
+      <w:pPr>
+        <w:keepLines/>
+        <w:spacing w:before="0" w:after="80"/>
+        <w:ind w:left="180" w:right="120"/>
+        <w:shd w:val="clear" w:color="auto" w:fill="FDF1F1"/>
+        <w:pBdr>
+          <w:left w:val="single" w:sz="20" w:space="8" w:color="C96D6D"/>
+        </w:pBdr>
+      </w:pPr>
+      <w:r>
+        <w:rPr>
+          <w:color w:val="6B3030"/>
+        </w:rPr>
+        <w:t xml:space="preserve">C) The point name determines causation by itself.</w:t>
+      </w:r>
+      <w:r>
+        <w:br/>
+      </w:r>
+      <w:r>
+        <w:rPr>
+          <w:color w:val="6B3030"/>
+        </w:rPr>
+        <w:t xml:space="preserve">A point name cannot establish causality.</w:t>
       </w:r>
     </w:p>
     <w:p>
@@ -1123,20 +1741,123 @@
     </w:p>
     <w:p>
       <w:pPr>
+        <w:keepNext/>
+        <w:spacing w:before="100" w:after="50"/>
+      </w:pPr>
+      <w:r>
+        <w:rPr>
+          <w:b/>
+          <w:color w:val="17324D"/>
+        </w:rPr>
+        <w:t xml:space="preserve">Why the correct answer is correct</w:t>
+      </w:r>
+    </w:p>
+    <w:p>
+      <w:pPr>
         <w:keepLines/>
         <w:spacing w:before="0" w:after="100"/>
         <w:ind w:left="180" w:right="120"/>
-        <w:shd w:val="clear" w:color="auto" w:fill="EEF7FA"/>
-        <w:pBdr>
-          <w:left w:val="single" w:sz="20" w:space="8" w:color="58A6B8"/>
-        </w:pBdr>
-      </w:pPr>
-      <w:r>
-        <w:rPr>
-          <w:i/>
-          <w:color w:val="31586B"/>
-        </w:rPr>
-        <w:t xml:space="preserve">Correct-answer feedback: The chapter supports recognition and escalation, not independent procedural management. Why are the other options incorrect? Practice removal techniques from the summary alone. — Procedural management requires complete training and supervision. Classify all three as pregnancy issues. — They are instrument or movement events, not pregnancy categories. Infer a single identical response for all three. — The events have different mechanisms and implications.</w:t>
+        <w:shd w:val="clear" w:color="auto" w:fill="EAF6EE"/>
+        <w:pBdr>
+          <w:left w:val="single" w:sz="20" w:space="8" w:color="2E8B57"/>
+        </w:pBdr>
+      </w:pPr>
+      <w:r>
+        <w:rPr>
+          <w:color w:val="245B38"/>
+        </w:rPr>
+        <w:t xml:space="preserve">The chapter supports recognition and escalation, not independent procedural management.</w:t>
+      </w:r>
+    </w:p>
+    <w:p>
+      <w:pPr>
+        <w:keepNext/>
+        <w:spacing w:before="100" w:after="50"/>
+      </w:pPr>
+      <w:r>
+        <w:rPr>
+          <w:b/>
+          <w:color w:val="17324D"/>
+        </w:rPr>
+        <w:t xml:space="preserve">Why the other options are incorrect</w:t>
+      </w:r>
+    </w:p>
+    <w:p>
+      <w:pPr>
+        <w:keepLines/>
+        <w:spacing w:before="0" w:after="80"/>
+        <w:ind w:left="180" w:right="120"/>
+        <w:shd w:val="clear" w:color="auto" w:fill="FDF1F1"/>
+        <w:pBdr>
+          <w:left w:val="single" w:sz="20" w:space="8" w:color="C96D6D"/>
+        </w:pBdr>
+      </w:pPr>
+      <w:r>
+        <w:rPr>
+          <w:color w:val="6B3030"/>
+        </w:rPr>
+        <w:t xml:space="preserve">A) Practice removal techniques from the summary alone.</w:t>
+      </w:r>
+      <w:r>
+        <w:br/>
+      </w:r>
+      <w:r>
+        <w:rPr>
+          <w:color w:val="6B3030"/>
+        </w:rPr>
+        <w:t xml:space="preserve">Procedural management requires complete training and supervision.</w:t>
+      </w:r>
+    </w:p>
+    <w:p>
+      <w:pPr>
+        <w:keepLines/>
+        <w:spacing w:before="0" w:after="80"/>
+        <w:ind w:left="180" w:right="120"/>
+        <w:shd w:val="clear" w:color="auto" w:fill="FDF1F1"/>
+        <w:pBdr>
+          <w:left w:val="single" w:sz="20" w:space="8" w:color="C96D6D"/>
+        </w:pBdr>
+      </w:pPr>
+      <w:r>
+        <w:rPr>
+          <w:color w:val="6B3030"/>
+        </w:rPr>
+        <w:t xml:space="preserve">B) Classify all three as pregnancy issues.</w:t>
+      </w:r>
+      <w:r>
+        <w:br/>
+      </w:r>
+      <w:r>
+        <w:rPr>
+          <w:color w:val="6B3030"/>
+        </w:rPr>
+        <w:t xml:space="preserve">They are instrument or movement events, not pregnancy categories.</w:t>
+      </w:r>
+    </w:p>
+    <w:p>
+      <w:pPr>
+        <w:keepLines/>
+        <w:spacing w:before="0" w:after="80"/>
+        <w:ind w:left="180" w:right="120"/>
+        <w:shd w:val="clear" w:color="auto" w:fill="FDF1F1"/>
+        <w:pBdr>
+          <w:left w:val="single" w:sz="20" w:space="8" w:color="C96D6D"/>
+        </w:pBdr>
+      </w:pPr>
+      <w:r>
+        <w:rPr>
+          <w:color w:val="6B3030"/>
+        </w:rPr>
+        <w:t xml:space="preserve">D) Infer a single identical response for all three.</w:t>
+      </w:r>
+      <w:r>
+        <w:br/>
+      </w:r>
+      <w:r>
+        <w:rPr>
+          <w:color w:val="6B3030"/>
+        </w:rPr>
+        <w:t xml:space="preserve">The events have different mechanisms and implications.</w:t>
       </w:r>
     </w:p>
     <w:p>
@@ -1264,20 +1985,123 @@
     </w:p>
     <w:p>
       <w:pPr>
+        <w:keepNext/>
+        <w:spacing w:before="100" w:after="50"/>
+      </w:pPr>
+      <w:r>
+        <w:rPr>
+          <w:b/>
+          <w:color w:val="17324D"/>
+        </w:rPr>
+        <w:t xml:space="preserve">Why the correct answer is correct</w:t>
+      </w:r>
+    </w:p>
+    <w:p>
+      <w:pPr>
         <w:keepLines/>
         <w:spacing w:before="0" w:after="100"/>
         <w:ind w:left="180" w:right="120"/>
-        <w:shd w:val="clear" w:color="auto" w:fill="EEF7FA"/>
-        <w:pBdr>
-          <w:left w:val="single" w:sz="20" w:space="8" w:color="58A6B8"/>
-        </w:pBdr>
-      </w:pPr>
-      <w:r>
-        <w:rPr>
-          <w:i/>
-          <w:color w:val="31586B"/>
-        </w:rPr>
-        <w:t xml:space="preserve">Correct-answer feedback: The useful Board-level relationship is event recognition plus appropriate protocol. Why are the other options incorrect? Assume it is caused by a nerve. — Hematoma is principally a bleeding or vessel-related finding. Treat every discoloration as an arterial emergency. — Appearance alone does not establish the vessel or severity. Memorize only the point name. — Mechanism and presentation matter in clinical vignettes.</w:t>
+        <w:shd w:val="clear" w:color="auto" w:fill="EAF6EE"/>
+        <w:pBdr>
+          <w:left w:val="single" w:sz="20" w:space="8" w:color="2E8B57"/>
+        </w:pBdr>
+      </w:pPr>
+      <w:r>
+        <w:rPr>
+          <w:color w:val="245B38"/>
+        </w:rPr>
+        <w:t xml:space="preserve">The useful Board-level relationship is event recognition plus appropriate protocol.</w:t>
+      </w:r>
+    </w:p>
+    <w:p>
+      <w:pPr>
+        <w:keepNext/>
+        <w:spacing w:before="100" w:after="50"/>
+      </w:pPr>
+      <w:r>
+        <w:rPr>
+          <w:b/>
+          <w:color w:val="17324D"/>
+        </w:rPr>
+        <w:t xml:space="preserve">Why the other options are incorrect</w:t>
+      </w:r>
+    </w:p>
+    <w:p>
+      <w:pPr>
+        <w:keepLines/>
+        <w:spacing w:before="0" w:after="80"/>
+        <w:ind w:left="180" w:right="120"/>
+        <w:shd w:val="clear" w:color="auto" w:fill="FDF1F1"/>
+        <w:pBdr>
+          <w:left w:val="single" w:sz="20" w:space="8" w:color="C96D6D"/>
+        </w:pBdr>
+      </w:pPr>
+      <w:r>
+        <w:rPr>
+          <w:color w:val="6B3030"/>
+        </w:rPr>
+        <w:t xml:space="preserve">A) Assume it is caused by a nerve.</w:t>
+      </w:r>
+      <w:r>
+        <w:br/>
+      </w:r>
+      <w:r>
+        <w:rPr>
+          <w:color w:val="6B3030"/>
+        </w:rPr>
+        <w:t xml:space="preserve">Hematoma is principally a bleeding or vessel-related finding.</w:t>
+      </w:r>
+    </w:p>
+    <w:p>
+      <w:pPr>
+        <w:keepLines/>
+        <w:spacing w:before="0" w:after="80"/>
+        <w:ind w:left="180" w:right="120"/>
+        <w:shd w:val="clear" w:color="auto" w:fill="FDF1F1"/>
+        <w:pBdr>
+          <w:left w:val="single" w:sz="20" w:space="8" w:color="C96D6D"/>
+        </w:pBdr>
+      </w:pPr>
+      <w:r>
+        <w:rPr>
+          <w:color w:val="6B3030"/>
+        </w:rPr>
+        <w:t xml:space="preserve">C) Treat every discoloration as an arterial emergency.</w:t>
+      </w:r>
+      <w:r>
+        <w:br/>
+      </w:r>
+      <w:r>
+        <w:rPr>
+          <w:color w:val="6B3030"/>
+        </w:rPr>
+        <w:t xml:space="preserve">Appearance alone does not establish the vessel or severity.</w:t>
+      </w:r>
+    </w:p>
+    <w:p>
+      <w:pPr>
+        <w:keepLines/>
+        <w:spacing w:before="0" w:after="80"/>
+        <w:ind w:left="180" w:right="120"/>
+        <w:shd w:val="clear" w:color="auto" w:fill="FDF1F1"/>
+        <w:pBdr>
+          <w:left w:val="single" w:sz="20" w:space="8" w:color="C96D6D"/>
+        </w:pBdr>
+      </w:pPr>
+      <w:r>
+        <w:rPr>
+          <w:color w:val="6B3030"/>
+        </w:rPr>
+        <w:t xml:space="preserve">D) Memorize only the point name.</w:t>
+      </w:r>
+      <w:r>
+        <w:br/>
+      </w:r>
+      <w:r>
+        <w:rPr>
+          <w:color w:val="6B3030"/>
+        </w:rPr>
+        <w:t xml:space="preserve">Mechanism and presentation matter in clinical vignettes.</w:t>
       </w:r>
     </w:p>
     <w:p>
@@ -1405,20 +2229,123 @@
     </w:p>
     <w:p>
       <w:pPr>
+        <w:keepNext/>
+        <w:spacing w:before="100" w:after="50"/>
+      </w:pPr>
+      <w:r>
+        <w:rPr>
+          <w:b/>
+          <w:color w:val="17324D"/>
+        </w:rPr>
+        <w:t xml:space="preserve">Why the correct answer is correct</w:t>
+      </w:r>
+    </w:p>
+    <w:p>
+      <w:pPr>
         <w:keepLines/>
         <w:spacing w:before="0" w:after="100"/>
         <w:ind w:left="180" w:right="120"/>
-        <w:shd w:val="clear" w:color="auto" w:fill="EEF7FA"/>
-        <w:pBdr>
-          <w:left w:val="single" w:sz="20" w:space="8" w:color="58A6B8"/>
-        </w:pBdr>
-      </w:pPr>
-      <w:r>
-        <w:rPr>
-          <w:i/>
-          <w:color w:val="31586B"/>
-        </w:rPr>
-        <w:t xml:space="preserve">Correct-answer feedback: One patient-context label does not replace a second anatomical risk analysis. Why are the other options incorrect? Choose pregnancy and ignore anatomy. — Both independent dimensions remain relevant. Choose pleura and ignore the patient. — Patient context must still be screened. Combine both into a modality restriction. — Neither factor automatically identifies a named modality.</w:t>
+        <w:shd w:val="clear" w:color="auto" w:fill="EAF6EE"/>
+        <w:pBdr>
+          <w:left w:val="single" w:sz="20" w:space="8" w:color="2E8B57"/>
+        </w:pBdr>
+      </w:pPr>
+      <w:r>
+        <w:rPr>
+          <w:color w:val="245B38"/>
+        </w:rPr>
+        <w:t xml:space="preserve">One patient-context label does not replace a second anatomical risk analysis.</w:t>
+      </w:r>
+    </w:p>
+    <w:p>
+      <w:pPr>
+        <w:keepNext/>
+        <w:spacing w:before="100" w:after="50"/>
+      </w:pPr>
+      <w:r>
+        <w:rPr>
+          <w:b/>
+          <w:color w:val="17324D"/>
+        </w:rPr>
+        <w:t xml:space="preserve">Why the other options are incorrect</w:t>
+      </w:r>
+    </w:p>
+    <w:p>
+      <w:pPr>
+        <w:keepLines/>
+        <w:spacing w:before="0" w:after="80"/>
+        <w:ind w:left="180" w:right="120"/>
+        <w:shd w:val="clear" w:color="auto" w:fill="FDF1F1"/>
+        <w:pBdr>
+          <w:left w:val="single" w:sz="20" w:space="8" w:color="C96D6D"/>
+        </w:pBdr>
+      </w:pPr>
+      <w:r>
+        <w:rPr>
+          <w:color w:val="6B3030"/>
+        </w:rPr>
+        <w:t xml:space="preserve">B) Choose pregnancy and ignore anatomy.</w:t>
+      </w:r>
+      <w:r>
+        <w:br/>
+      </w:r>
+      <w:r>
+        <w:rPr>
+          <w:color w:val="6B3030"/>
+        </w:rPr>
+        <w:t xml:space="preserve">Both independent dimensions remain relevant.</w:t>
+      </w:r>
+    </w:p>
+    <w:p>
+      <w:pPr>
+        <w:keepLines/>
+        <w:spacing w:before="0" w:after="80"/>
+        <w:ind w:left="180" w:right="120"/>
+        <w:shd w:val="clear" w:color="auto" w:fill="FDF1F1"/>
+        <w:pBdr>
+          <w:left w:val="single" w:sz="20" w:space="8" w:color="C96D6D"/>
+        </w:pBdr>
+      </w:pPr>
+      <w:r>
+        <w:rPr>
+          <w:color w:val="6B3030"/>
+        </w:rPr>
+        <w:t xml:space="preserve">C) Choose pleura and ignore the patient.</w:t>
+      </w:r>
+      <w:r>
+        <w:br/>
+      </w:r>
+      <w:r>
+        <w:rPr>
+          <w:color w:val="6B3030"/>
+        </w:rPr>
+        <w:t xml:space="preserve">Patient context must still be screened.</w:t>
+      </w:r>
+    </w:p>
+    <w:p>
+      <w:pPr>
+        <w:keepLines/>
+        <w:spacing w:before="0" w:after="80"/>
+        <w:ind w:left="180" w:right="120"/>
+        <w:shd w:val="clear" w:color="auto" w:fill="FDF1F1"/>
+        <w:pBdr>
+          <w:left w:val="single" w:sz="20" w:space="8" w:color="C96D6D"/>
+        </w:pBdr>
+      </w:pPr>
+      <w:r>
+        <w:rPr>
+          <w:color w:val="6B3030"/>
+        </w:rPr>
+        <w:t xml:space="preserve">D) Combine both into a modality restriction.</w:t>
+      </w:r>
+      <w:r>
+        <w:br/>
+      </w:r>
+      <w:r>
+        <w:rPr>
+          <w:color w:val="6B3030"/>
+        </w:rPr>
+        <w:t xml:space="preserve">Neither factor automatically identifies a named modality.</w:t>
       </w:r>
     </w:p>
     <w:p>
@@ -1546,20 +2473,123 @@
     </w:p>
     <w:p>
       <w:pPr>
+        <w:keepNext/>
+        <w:spacing w:before="100" w:after="50"/>
+      </w:pPr>
+      <w:r>
+        <w:rPr>
+          <w:b/>
+          <w:color w:val="17324D"/>
+        </w:rPr>
+        <w:t xml:space="preserve">Why the correct answer is correct</w:t>
+      </w:r>
+    </w:p>
+    <w:p>
+      <w:pPr>
         <w:keepLines/>
         <w:spacing w:before="0" w:after="100"/>
         <w:ind w:left="180" w:right="120"/>
-        <w:shd w:val="clear" w:color="auto" w:fill="EEF7FA"/>
-        <w:pBdr>
-          <w:left w:val="single" w:sz="20" w:space="8" w:color="58A6B8"/>
-        </w:pBdr>
-      </w:pPr>
-      <w:r>
-        <w:rPr>
-          <w:i/>
-          <w:color w:val="31586B"/>
-        </w:rPr>
-        <w:t xml:space="preserve">Correct-answer feedback: Screening establishes the information needed before anatomical classification and source review. Why are the other options incorrect? Select a point from memory. — Selection before screening skips essential context. Jump to the final reflection. — Reflection follows learning and assessment. Assume the old bank contains the complete rule. — A short bank is not a substitute for a complete current source.</w:t>
+        <w:shd w:val="clear" w:color="auto" w:fill="EAF6EE"/>
+        <w:pBdr>
+          <w:left w:val="single" w:sz="20" w:space="8" w:color="2E8B57"/>
+        </w:pBdr>
+      </w:pPr>
+      <w:r>
+        <w:rPr>
+          <w:color w:val="245B38"/>
+        </w:rPr>
+        <w:t xml:space="preserve">Screening establishes the information needed before anatomical classification and source review.</w:t>
+      </w:r>
+    </w:p>
+    <w:p>
+      <w:pPr>
+        <w:keepNext/>
+        <w:spacing w:before="100" w:after="50"/>
+      </w:pPr>
+      <w:r>
+        <w:rPr>
+          <w:b/>
+          <w:color w:val="17324D"/>
+        </w:rPr>
+        <w:t xml:space="preserve">Why the other options are incorrect</w:t>
+      </w:r>
+    </w:p>
+    <w:p>
+      <w:pPr>
+        <w:keepLines/>
+        <w:spacing w:before="0" w:after="80"/>
+        <w:ind w:left="180" w:right="120"/>
+        <w:shd w:val="clear" w:color="auto" w:fill="FDF1F1"/>
+        <w:pBdr>
+          <w:left w:val="single" w:sz="20" w:space="8" w:color="C96D6D"/>
+        </w:pBdr>
+      </w:pPr>
+      <w:r>
+        <w:rPr>
+          <w:color w:val="6B3030"/>
+        </w:rPr>
+        <w:t xml:space="preserve">A) Select a point from memory.</w:t>
+      </w:r>
+      <w:r>
+        <w:br/>
+      </w:r>
+      <w:r>
+        <w:rPr>
+          <w:color w:val="6B3030"/>
+        </w:rPr>
+        <w:t xml:space="preserve">Selection before screening skips essential context.</w:t>
+      </w:r>
+    </w:p>
+    <w:p>
+      <w:pPr>
+        <w:keepLines/>
+        <w:spacing w:before="0" w:after="80"/>
+        <w:ind w:left="180" w:right="120"/>
+        <w:shd w:val="clear" w:color="auto" w:fill="FDF1F1"/>
+        <w:pBdr>
+          <w:left w:val="single" w:sz="20" w:space="8" w:color="C96D6D"/>
+        </w:pBdr>
+      </w:pPr>
+      <w:r>
+        <w:rPr>
+          <w:color w:val="6B3030"/>
+        </w:rPr>
+        <w:t xml:space="preserve">B) Jump to the final reflection.</w:t>
+      </w:r>
+      <w:r>
+        <w:br/>
+      </w:r>
+      <w:r>
+        <w:rPr>
+          <w:color w:val="6B3030"/>
+        </w:rPr>
+        <w:t xml:space="preserve">Reflection follows learning and assessment.</w:t>
+      </w:r>
+    </w:p>
+    <w:p>
+      <w:pPr>
+        <w:keepLines/>
+        <w:spacing w:before="0" w:after="80"/>
+        <w:ind w:left="180" w:right="120"/>
+        <w:shd w:val="clear" w:color="auto" w:fill="FDF1F1"/>
+        <w:pBdr>
+          <w:left w:val="single" w:sz="20" w:space="8" w:color="C96D6D"/>
+        </w:pBdr>
+      </w:pPr>
+      <w:r>
+        <w:rPr>
+          <w:color w:val="6B3030"/>
+        </w:rPr>
+        <w:t xml:space="preserve">C) Assume the old bank contains the complete rule.</w:t>
+      </w:r>
+      <w:r>
+        <w:br/>
+      </w:r>
+      <w:r>
+        <w:rPr>
+          <w:color w:val="6B3030"/>
+        </w:rPr>
+        <w:t xml:space="preserve">A short bank is not a substitute for a complete current source.</w:t>
       </w:r>
     </w:p>
     <w:p>

</xml_diff>